<commit_message>
Add project folders and documentation
</commit_message>
<xml_diff>
--- a/Install and Run Files/Allure.docx
+++ b/Install and Run Files/Allure.docx
@@ -11,30 +11,8 @@
           <w:szCs w:val="24"/>
         </w:rPr>
       </w:pPr>
-      <w:r>
-        <w:rPr>
-          <w:rFonts w:ascii="Times New Roman" w:eastAsia="Times New Roman" w:hAnsi="Times New Roman" w:cs="Times New Roman"/>
-          <w:sz w:val="24"/>
-          <w:szCs w:val="24"/>
-        </w:rPr>
-        <w:t xml:space="preserve">Perfect. </w:t>
-      </w:r>
-      <w:r>
-        <w:rPr>
-          <w:rFonts w:ascii="Segoe UI Symbol" w:eastAsia="Times New Roman" w:hAnsi="Segoe UI Symbol" w:cs="Segoe UI Symbol"/>
-          <w:sz w:val="24"/>
-          <w:szCs w:val="24"/>
-        </w:rPr>
-        <w:t>👍</w:t>
-      </w:r>
-      <w:r>
-        <w:rPr>
-          <w:rFonts w:ascii="Times New Roman" w:eastAsia="Times New Roman" w:hAnsi="Times New Roman" w:cs="Times New Roman"/>
-          <w:sz w:val="24"/>
-          <w:szCs w:val="24"/>
-        </w:rPr>
-        <w:t xml:space="preserve"> </w:t>
-      </w:r>
+      <w:bookmarkStart w:id="0" w:name="_GoBack"/>
+      <w:bookmarkEnd w:id="0"/>
       <w:r>
         <w:rPr>
           <w:rFonts w:ascii="Times New Roman" w:eastAsia="Times New Roman" w:hAnsi="Times New Roman" w:cs="Times New Roman"/>
@@ -4902,10 +4880,7 @@
         <w:t>. Let's first get your local Jenkins build working successfully.</w:t>
       </w:r>
     </w:p>
-    <w:p>
-      <w:bookmarkStart w:id="0" w:name="_GoBack"/>
-      <w:bookmarkEnd w:id="0"/>
-    </w:p>
+    <w:p/>
     <w:sectPr>
       <w:pgSz w:w="12240" w:h="15840"/>
       <w:pgMar w:top="1440" w:right="1440" w:bottom="1440" w:left="1440" w:header="720" w:footer="720" w:gutter="0"/>

</xml_diff>